<commit_message>
docs: update presentation with repo URL, bug fixes, and full built-for-real list
- Add GitHub repo URL to submission package and playbook section
- Expand "Built for real" with hydration fix, CLS fix, wide-screen
  layout, and dual-layer input validation
- Regenerate presentation.docx
</commit_message>
<xml_diff>
--- a/mal-approval-engine-presentation.docx
+++ b/mal-approval-engine-presentation.docx
@@ -70,7 +70,7 @@
       <w:pPr>
         <w:spacing w:after="80" w:before="0"/>
       </w:pPr>
-      <w:hyperlink w:history="1" r:id="rIdyoldaeosszejxomgbtqgk">
+      <w:hyperlink w:history="1" r:id="rIdsqtvh6zk-ljbel7uziag5">
         <w:r>
           <w:rPr>
             <w:rFonts w:ascii="Arial" w:cs="Arial" w:eastAsia="Arial" w:hAnsi="Arial"/>
@@ -1678,6 +1678,572 @@
       </w:r>
     </w:p>
     <w:p>
+      <w:pPr>
+        <w:spacing w:after="200" w:before="0"/>
+      </w:pPr>
+    </w:p>
+    <w:p>
+      <w:pPr>
+        <w:spacing w:after="80" w:before="240"/>
+      </w:pPr>
+      <w:r>
+        <w:rPr>
+          <w:rFonts w:ascii="Arial" w:cs="Arial" w:eastAsia="Arial" w:hAnsi="Arial"/>
+          <w:b/>
+          <w:bCs/>
+          <w:color w:val="111827"/>
+          <w:sz w:val="24"/>
+          <w:szCs w:val="24"/>
+        </w:rPr>
+        <w:t xml:space="preserve">Screenshots</w:t>
+      </w:r>
+    </w:p>
+    <w:p>
+      <w:pPr>
+        <w:spacing w:after="80" w:before="0"/>
+      </w:pPr>
+    </w:p>
+    <w:tbl>
+      <w:tblPr>
+        <w:tblW w:type="dxa" w:w="9360"/>
+        <w:tblBorders>
+          <w:top w:val="single" w:color="auto" w:sz="4"/>
+          <w:left w:val="single" w:color="auto" w:sz="4"/>
+          <w:bottom w:val="single" w:color="auto" w:sz="4"/>
+          <w:right w:val="single" w:color="auto" w:sz="4"/>
+          <w:insideH w:val="single" w:color="auto" w:sz="4"/>
+          <w:insideV w:val="single" w:color="auto" w:sz="4"/>
+        </w:tblBorders>
+      </w:tblPr>
+      <w:tblGrid>
+        <w:gridCol w:w="4680"/>
+        <w:gridCol w:w="4680"/>
+      </w:tblGrid>
+      <w:tr>
+        <w:tc>
+          <w:tcPr>
+            <w:tcW w:type="dxa" w:w="4680"/>
+            <w:tcBorders>
+              <w:top w:val="single" w:color="E5E7EB" w:sz="1"/>
+              <w:left w:val="single" w:color="E5E7EB" w:sz="1"/>
+              <w:bottom w:val="single" w:color="E5E7EB" w:sz="1"/>
+              <w:right w:val="single" w:color="E5E7EB" w:sz="1"/>
+            </w:tcBorders>
+            <w:tcMar>
+              <w:top w:type="dxa" w:w="100"/>
+              <w:left w:type="dxa" w:w="100"/>
+              <w:bottom w:type="dxa" w:w="100"/>
+              <w:right w:type="dxa" w:w="100"/>
+            </w:tcMar>
+          </w:tcPr>
+          <w:p>
+            <w:pPr>
+              <w:spacing w:after="60" w:before="0"/>
+              <w:jc w:val="center"/>
+            </w:pPr>
+            <w:r>
+              <w:drawing>
+                <wp:inline distT="0" distB="0" distL="0" distR="0">
+                  <wp:extent cx="2857500" cy="1790700"/>
+                  <wp:effectExtent t="0" r="0" b="0" l="0"/>
+                  <wp:docPr id="1" name="Employee dashboard" descr="Employee dashboard" title="Employee dashboard"/>
+                  <wp:cNvGraphicFramePr>
+                    <a:graphicFrameLocks xmlns:a="http://schemas.openxmlformats.org/drawingml/2006/main" noChangeAspect="1"/>
+                  </wp:cNvGraphicFramePr>
+                  <a:graphic xmlns:a="http://schemas.openxmlformats.org/drawingml/2006/main">
+                    <a:graphicData uri="http://schemas.openxmlformats.org/drawingml/2006/picture">
+                      <pic:pic xmlns:pic="http://schemas.openxmlformats.org/drawingml/2006/picture">
+                        <pic:nvPicPr>
+                          <pic:cNvPr id="0" name="" descr=""/>
+                          <pic:cNvPicPr>
+                            <a:picLocks noChangeAspect="1" noChangeArrowheads="1"/>
+                          </pic:cNvPicPr>
+                        </pic:nvPicPr>
+                        <pic:blipFill>
+                          <a:blip r:embed="rId9" cstate="none"/>
+                          <a:srcRect/>
+                          <a:stretch>
+                            <a:fillRect/>
+                          </a:stretch>
+                        </pic:blipFill>
+                        <pic:spPr bwMode="auto">
+                          <a:xfrm>
+                            <a:off x="0" y="0"/>
+                            <a:ext cx="2857500" cy="1790700"/>
+                          </a:xfrm>
+                          <a:prstGeom prst="rect">
+                            <a:avLst/>
+                          </a:prstGeom>
+                        </pic:spPr>
+                      </pic:pic>
+                    </a:graphicData>
+                  </a:graphic>
+                </wp:inline>
+              </w:drawing>
+            </w:r>
+          </w:p>
+          <w:p>
+            <w:pPr>
+              <w:spacing w:after="0" w:before="0"/>
+              <w:jc w:val="center"/>
+            </w:pPr>
+            <w:r>
+              <w:rPr>
+                <w:rFonts w:ascii="Arial" w:cs="Arial" w:eastAsia="Arial" w:hAnsi="Arial"/>
+                <w:color w:val="6B7280"/>
+                <w:sz w:val="18"/>
+                <w:szCs w:val="18"/>
+              </w:rPr>
+              <w:t xml:space="preserve">Employee dashboard</w:t>
+            </w:r>
+          </w:p>
+        </w:tc>
+        <w:tc>
+          <w:tcPr>
+            <w:tcW w:type="dxa" w:w="4680"/>
+            <w:tcBorders>
+              <w:top w:val="single" w:color="E5E7EB" w:sz="1"/>
+              <w:left w:val="single" w:color="E5E7EB" w:sz="1"/>
+              <w:bottom w:val="single" w:color="E5E7EB" w:sz="1"/>
+              <w:right w:val="single" w:color="E5E7EB" w:sz="1"/>
+            </w:tcBorders>
+            <w:tcMar>
+              <w:top w:type="dxa" w:w="100"/>
+              <w:left w:type="dxa" w:w="100"/>
+              <w:bottom w:type="dxa" w:w="100"/>
+              <w:right w:type="dxa" w:w="100"/>
+            </w:tcMar>
+          </w:tcPr>
+          <w:p>
+            <w:pPr>
+              <w:spacing w:after="60" w:before="0"/>
+              <w:jc w:val="center"/>
+            </w:pPr>
+            <w:r>
+              <w:drawing>
+                <wp:inline distT="0" distB="0" distL="0" distR="0">
+                  <wp:extent cx="2857500" cy="1790700"/>
+                  <wp:effectExtent t="0" r="0" b="0" l="0"/>
+                  <wp:docPr id="1" name="Budget request form" descr="Budget request form" title="Budget request form"/>
+                  <wp:cNvGraphicFramePr>
+                    <a:graphicFrameLocks xmlns:a="http://schemas.openxmlformats.org/drawingml/2006/main" noChangeAspect="1"/>
+                  </wp:cNvGraphicFramePr>
+                  <a:graphic xmlns:a="http://schemas.openxmlformats.org/drawingml/2006/main">
+                    <a:graphicData uri="http://schemas.openxmlformats.org/drawingml/2006/picture">
+                      <pic:pic xmlns:pic="http://schemas.openxmlformats.org/drawingml/2006/picture">
+                        <pic:nvPicPr>
+                          <pic:cNvPr id="0" name="" descr=""/>
+                          <pic:cNvPicPr>
+                            <a:picLocks noChangeAspect="1" noChangeArrowheads="1"/>
+                          </pic:cNvPicPr>
+                        </pic:nvPicPr>
+                        <pic:blipFill>
+                          <a:blip r:embed="rId10" cstate="none"/>
+                          <a:srcRect/>
+                          <a:stretch>
+                            <a:fillRect/>
+                          </a:stretch>
+                        </pic:blipFill>
+                        <pic:spPr bwMode="auto">
+                          <a:xfrm>
+                            <a:off x="0" y="0"/>
+                            <a:ext cx="2857500" cy="1790700"/>
+                          </a:xfrm>
+                          <a:prstGeom prst="rect">
+                            <a:avLst/>
+                          </a:prstGeom>
+                        </pic:spPr>
+                      </pic:pic>
+                    </a:graphicData>
+                  </a:graphic>
+                </wp:inline>
+              </w:drawing>
+            </w:r>
+          </w:p>
+          <w:p>
+            <w:pPr>
+              <w:spacing w:after="0" w:before="0"/>
+              <w:jc w:val="center"/>
+            </w:pPr>
+            <w:r>
+              <w:rPr>
+                <w:rFonts w:ascii="Arial" w:cs="Arial" w:eastAsia="Arial" w:hAnsi="Arial"/>
+                <w:color w:val="6B7280"/>
+                <w:sz w:val="18"/>
+                <w:szCs w:val="18"/>
+              </w:rPr>
+              <w:t xml:space="preserve">Budget request form</w:t>
+            </w:r>
+          </w:p>
+        </w:tc>
+      </w:tr>
+    </w:tbl>
+    <w:p>
+      <w:pPr>
+        <w:spacing w:after="120" w:before="0"/>
+      </w:pPr>
+    </w:p>
+    <w:tbl>
+      <w:tblPr>
+        <w:tblW w:type="dxa" w:w="9360"/>
+        <w:tblBorders>
+          <w:top w:val="single" w:color="auto" w:sz="4"/>
+          <w:left w:val="single" w:color="auto" w:sz="4"/>
+          <w:bottom w:val="single" w:color="auto" w:sz="4"/>
+          <w:right w:val="single" w:color="auto" w:sz="4"/>
+          <w:insideH w:val="single" w:color="auto" w:sz="4"/>
+          <w:insideV w:val="single" w:color="auto" w:sz="4"/>
+        </w:tblBorders>
+      </w:tblPr>
+      <w:tblGrid>
+        <w:gridCol w:w="4680"/>
+        <w:gridCol w:w="4680"/>
+      </w:tblGrid>
+      <w:tr>
+        <w:tc>
+          <w:tcPr>
+            <w:tcW w:type="dxa" w:w="4680"/>
+            <w:tcBorders>
+              <w:top w:val="single" w:color="E5E7EB" w:sz="1"/>
+              <w:left w:val="single" w:color="E5E7EB" w:sz="1"/>
+              <w:bottom w:val="single" w:color="E5E7EB" w:sz="1"/>
+              <w:right w:val="single" w:color="E5E7EB" w:sz="1"/>
+            </w:tcBorders>
+            <w:tcMar>
+              <w:top w:type="dxa" w:w="100"/>
+              <w:left w:type="dxa" w:w="100"/>
+              <w:bottom w:type="dxa" w:w="100"/>
+              <w:right w:type="dxa" w:w="100"/>
+            </w:tcMar>
+          </w:tcPr>
+          <w:p>
+            <w:pPr>
+              <w:spacing w:after="60" w:before="0"/>
+              <w:jc w:val="center"/>
+            </w:pPr>
+            <w:r>
+              <w:drawing>
+                <wp:inline distT="0" distB="0" distL="0" distR="0">
+                  <wp:extent cx="2857500" cy="1790700"/>
+                  <wp:effectExtent t="0" r="0" b="0" l="0"/>
+                  <wp:docPr id="1" name="AI summary on submission" descr="AI summary on submission" title="AI summary on submission"/>
+                  <wp:cNvGraphicFramePr>
+                    <a:graphicFrameLocks xmlns:a="http://schemas.openxmlformats.org/drawingml/2006/main" noChangeAspect="1"/>
+                  </wp:cNvGraphicFramePr>
+                  <a:graphic xmlns:a="http://schemas.openxmlformats.org/drawingml/2006/main">
+                    <a:graphicData uri="http://schemas.openxmlformats.org/drawingml/2006/picture">
+                      <pic:pic xmlns:pic="http://schemas.openxmlformats.org/drawingml/2006/picture">
+                        <pic:nvPicPr>
+                          <pic:cNvPr id="0" name="" descr=""/>
+                          <pic:cNvPicPr>
+                            <a:picLocks noChangeAspect="1" noChangeArrowheads="1"/>
+                          </pic:cNvPicPr>
+                        </pic:nvPicPr>
+                        <pic:blipFill>
+                          <a:blip r:embed="rId11" cstate="none"/>
+                          <a:srcRect/>
+                          <a:stretch>
+                            <a:fillRect/>
+                          </a:stretch>
+                        </pic:blipFill>
+                        <pic:spPr bwMode="auto">
+                          <a:xfrm>
+                            <a:off x="0" y="0"/>
+                            <a:ext cx="2857500" cy="1790700"/>
+                          </a:xfrm>
+                          <a:prstGeom prst="rect">
+                            <a:avLst/>
+                          </a:prstGeom>
+                        </pic:spPr>
+                      </pic:pic>
+                    </a:graphicData>
+                  </a:graphic>
+                </wp:inline>
+              </w:drawing>
+            </w:r>
+          </w:p>
+          <w:p>
+            <w:pPr>
+              <w:spacing w:after="0" w:before="0"/>
+              <w:jc w:val="center"/>
+            </w:pPr>
+            <w:r>
+              <w:rPr>
+                <w:rFonts w:ascii="Arial" w:cs="Arial" w:eastAsia="Arial" w:hAnsi="Arial"/>
+                <w:color w:val="6B7280"/>
+                <w:sz w:val="18"/>
+                <w:szCs w:val="18"/>
+              </w:rPr>
+              <w:t xml:space="preserve">AI summary on submission</w:t>
+            </w:r>
+          </w:p>
+        </w:tc>
+        <w:tc>
+          <w:tcPr>
+            <w:tcW w:type="dxa" w:w="4680"/>
+            <w:tcBorders>
+              <w:top w:val="single" w:color="E5E7EB" w:sz="1"/>
+              <w:left w:val="single" w:color="E5E7EB" w:sz="1"/>
+              <w:bottom w:val="single" w:color="E5E7EB" w:sz="1"/>
+              <w:right w:val="single" w:color="E5E7EB" w:sz="1"/>
+            </w:tcBorders>
+            <w:tcMar>
+              <w:top w:type="dxa" w:w="100"/>
+              <w:left w:type="dxa" w:w="100"/>
+              <w:bottom w:type="dxa" w:w="100"/>
+              <w:right w:type="dxa" w:w="100"/>
+            </w:tcMar>
+          </w:tcPr>
+          <w:p>
+            <w:pPr>
+              <w:spacing w:after="60" w:before="0"/>
+              <w:jc w:val="center"/>
+            </w:pPr>
+            <w:r>
+              <w:drawing>
+                <wp:inline distT="0" distB="0" distL="0" distR="0">
+                  <wp:extent cx="2857500" cy="1790700"/>
+                  <wp:effectExtent t="0" r="0" b="0" l="0"/>
+                  <wp:docPr id="1" name="Realtime notification bell" descr="Realtime notification bell" title="Realtime notification bell"/>
+                  <wp:cNvGraphicFramePr>
+                    <a:graphicFrameLocks xmlns:a="http://schemas.openxmlformats.org/drawingml/2006/main" noChangeAspect="1"/>
+                  </wp:cNvGraphicFramePr>
+                  <a:graphic xmlns:a="http://schemas.openxmlformats.org/drawingml/2006/main">
+                    <a:graphicData uri="http://schemas.openxmlformats.org/drawingml/2006/picture">
+                      <pic:pic xmlns:pic="http://schemas.openxmlformats.org/drawingml/2006/picture">
+                        <pic:nvPicPr>
+                          <pic:cNvPr id="0" name="" descr=""/>
+                          <pic:cNvPicPr>
+                            <a:picLocks noChangeAspect="1" noChangeArrowheads="1"/>
+                          </pic:cNvPicPr>
+                        </pic:nvPicPr>
+                        <pic:blipFill>
+                          <a:blip r:embed="rId12" cstate="none"/>
+                          <a:srcRect/>
+                          <a:stretch>
+                            <a:fillRect/>
+                          </a:stretch>
+                        </pic:blipFill>
+                        <pic:spPr bwMode="auto">
+                          <a:xfrm>
+                            <a:off x="0" y="0"/>
+                            <a:ext cx="2857500" cy="1790700"/>
+                          </a:xfrm>
+                          <a:prstGeom prst="rect">
+                            <a:avLst/>
+                          </a:prstGeom>
+                        </pic:spPr>
+                      </pic:pic>
+                    </a:graphicData>
+                  </a:graphic>
+                </wp:inline>
+              </w:drawing>
+            </w:r>
+          </w:p>
+          <w:p>
+            <w:pPr>
+              <w:spacing w:after="0" w:before="0"/>
+              <w:jc w:val="center"/>
+            </w:pPr>
+            <w:r>
+              <w:rPr>
+                <w:rFonts w:ascii="Arial" w:cs="Arial" w:eastAsia="Arial" w:hAnsi="Arial"/>
+                <w:color w:val="6B7280"/>
+                <w:sz w:val="18"/>
+                <w:szCs w:val="18"/>
+              </w:rPr>
+              <w:t xml:space="preserve">Realtime notification bell</w:t>
+            </w:r>
+          </w:p>
+        </w:tc>
+      </w:tr>
+    </w:tbl>
+    <w:p>
+      <w:pPr>
+        <w:spacing w:after="120" w:before="0"/>
+      </w:pPr>
+    </w:p>
+    <w:tbl>
+      <w:tblPr>
+        <w:tblW w:type="dxa" w:w="9360"/>
+        <w:tblBorders>
+          <w:top w:val="single" w:color="auto" w:sz="4"/>
+          <w:left w:val="single" w:color="auto" w:sz="4"/>
+          <w:bottom w:val="single" w:color="auto" w:sz="4"/>
+          <w:right w:val="single" w:color="auto" w:sz="4"/>
+          <w:insideH w:val="single" w:color="auto" w:sz="4"/>
+          <w:insideV w:val="single" w:color="auto" w:sz="4"/>
+        </w:tblBorders>
+      </w:tblPr>
+      <w:tblGrid>
+        <w:gridCol w:w="4680"/>
+        <w:gridCol w:w="4680"/>
+      </w:tblGrid>
+      <w:tr>
+        <w:tc>
+          <w:tcPr>
+            <w:tcW w:type="dxa" w:w="4680"/>
+            <w:tcBorders>
+              <w:top w:val="single" w:color="E5E7EB" w:sz="1"/>
+              <w:left w:val="single" w:color="E5E7EB" w:sz="1"/>
+              <w:bottom w:val="single" w:color="E5E7EB" w:sz="1"/>
+              <w:right w:val="single" w:color="E5E7EB" w:sz="1"/>
+            </w:tcBorders>
+            <w:tcMar>
+              <w:top w:type="dxa" w:w="100"/>
+              <w:left w:type="dxa" w:w="100"/>
+              <w:bottom w:type="dxa" w:w="100"/>
+              <w:right w:type="dxa" w:w="100"/>
+            </w:tcMar>
+          </w:tcPr>
+          <w:p>
+            <w:pPr>
+              <w:spacing w:after="60" w:before="0"/>
+              <w:jc w:val="center"/>
+            </w:pPr>
+            <w:r>
+              <w:drawing>
+                <wp:inline distT="0" distB="0" distL="0" distR="0">
+                  <wp:extent cx="2857500" cy="1790700"/>
+                  <wp:effectExtent t="0" r="0" b="0" l="0"/>
+                  <wp:docPr id="1" name="Manager approval view" descr="Manager approval view" title="Manager approval view"/>
+                  <wp:cNvGraphicFramePr>
+                    <a:graphicFrameLocks xmlns:a="http://schemas.openxmlformats.org/drawingml/2006/main" noChangeAspect="1"/>
+                  </wp:cNvGraphicFramePr>
+                  <a:graphic xmlns:a="http://schemas.openxmlformats.org/drawingml/2006/main">
+                    <a:graphicData uri="http://schemas.openxmlformats.org/drawingml/2006/picture">
+                      <pic:pic xmlns:pic="http://schemas.openxmlformats.org/drawingml/2006/picture">
+                        <pic:nvPicPr>
+                          <pic:cNvPr id="0" name="" descr=""/>
+                          <pic:cNvPicPr>
+                            <a:picLocks noChangeAspect="1" noChangeArrowheads="1"/>
+                          </pic:cNvPicPr>
+                        </pic:nvPicPr>
+                        <pic:blipFill>
+                          <a:blip r:embed="rId13" cstate="none"/>
+                          <a:srcRect/>
+                          <a:stretch>
+                            <a:fillRect/>
+                          </a:stretch>
+                        </pic:blipFill>
+                        <pic:spPr bwMode="auto">
+                          <a:xfrm>
+                            <a:off x="0" y="0"/>
+                            <a:ext cx="2857500" cy="1790700"/>
+                          </a:xfrm>
+                          <a:prstGeom prst="rect">
+                            <a:avLst/>
+                          </a:prstGeom>
+                        </pic:spPr>
+                      </pic:pic>
+                    </a:graphicData>
+                  </a:graphic>
+                </wp:inline>
+              </w:drawing>
+            </w:r>
+          </w:p>
+          <w:p>
+            <w:pPr>
+              <w:spacing w:after="0" w:before="0"/>
+              <w:jc w:val="center"/>
+            </w:pPr>
+            <w:r>
+              <w:rPr>
+                <w:rFonts w:ascii="Arial" w:cs="Arial" w:eastAsia="Arial" w:hAnsi="Arial"/>
+                <w:color w:val="6B7280"/>
+                <w:sz w:val="18"/>
+                <w:szCs w:val="18"/>
+              </w:rPr>
+              <w:t xml:space="preserve">Manager approval view</w:t>
+            </w:r>
+          </w:p>
+        </w:tc>
+        <w:tc>
+          <w:tcPr>
+            <w:tcW w:type="dxa" w:w="4680"/>
+            <w:tcBorders>
+              <w:top w:val="single" w:color="E5E7EB" w:sz="1"/>
+              <w:left w:val="single" w:color="E5E7EB" w:sz="1"/>
+              <w:bottom w:val="single" w:color="E5E7EB" w:sz="1"/>
+              <w:right w:val="single" w:color="E5E7EB" w:sz="1"/>
+            </w:tcBorders>
+            <w:tcMar>
+              <w:top w:type="dxa" w:w="100"/>
+              <w:left w:type="dxa" w:w="100"/>
+              <w:bottom w:type="dxa" w:w="100"/>
+              <w:right w:type="dxa" w:w="100"/>
+            </w:tcMar>
+          </w:tcPr>
+          <w:p>
+            <w:pPr>
+              <w:spacing w:after="60" w:before="0"/>
+              <w:jc w:val="center"/>
+            </w:pPr>
+            <w:r>
+              <w:drawing>
+                <wp:inline distT="0" distB="0" distL="0" distR="0">
+                  <wp:extent cx="2857500" cy="1790700"/>
+                  <wp:effectExtent t="0" r="0" b="0" l="0"/>
+                  <wp:docPr id="1" name="Admin org-wide dashboard" descr="Admin org-wide dashboard" title="Admin org-wide dashboard"/>
+                  <wp:cNvGraphicFramePr>
+                    <a:graphicFrameLocks xmlns:a="http://schemas.openxmlformats.org/drawingml/2006/main" noChangeAspect="1"/>
+                  </wp:cNvGraphicFramePr>
+                  <a:graphic xmlns:a="http://schemas.openxmlformats.org/drawingml/2006/main">
+                    <a:graphicData uri="http://schemas.openxmlformats.org/drawingml/2006/picture">
+                      <pic:pic xmlns:pic="http://schemas.openxmlformats.org/drawingml/2006/picture">
+                        <pic:nvPicPr>
+                          <pic:cNvPr id="0" name="" descr=""/>
+                          <pic:cNvPicPr>
+                            <a:picLocks noChangeAspect="1" noChangeArrowheads="1"/>
+                          </pic:cNvPicPr>
+                        </pic:nvPicPr>
+                        <pic:blipFill>
+                          <a:blip r:embed="rId14" cstate="none"/>
+                          <a:srcRect/>
+                          <a:stretch>
+                            <a:fillRect/>
+                          </a:stretch>
+                        </pic:blipFill>
+                        <pic:spPr bwMode="auto">
+                          <a:xfrm>
+                            <a:off x="0" y="0"/>
+                            <a:ext cx="2857500" cy="1790700"/>
+                          </a:xfrm>
+                          <a:prstGeom prst="rect">
+                            <a:avLst/>
+                          </a:prstGeom>
+                        </pic:spPr>
+                      </pic:pic>
+                    </a:graphicData>
+                  </a:graphic>
+                </wp:inline>
+              </w:drawing>
+            </w:r>
+          </w:p>
+          <w:p>
+            <w:pPr>
+              <w:spacing w:after="0" w:before="0"/>
+              <w:jc w:val="center"/>
+            </w:pPr>
+            <w:r>
+              <w:rPr>
+                <w:rFonts w:ascii="Arial" w:cs="Arial" w:eastAsia="Arial" w:hAnsi="Arial"/>
+                <w:color w:val="6B7280"/>
+                <w:sz w:val="18"/>
+                <w:szCs w:val="18"/>
+              </w:rPr>
+              <w:t xml:space="preserve">Admin org-wide dashboard</w:t>
+            </w:r>
+          </w:p>
+        </w:tc>
+      </w:tr>
+    </w:tbl>
+    <w:p>
+      <w:pPr>
+        <w:spacing w:after="120" w:before="0"/>
+      </w:pPr>
+    </w:p>
+    <w:p>
       <w:r>
         <w:br w:type="page"/>
       </w:r>
@@ -2083,27 +2649,6 @@
     </w:p>
     <w:p>
       <w:pPr>
-        <w:spacing w:after="160" w:before="0"/>
-      </w:pPr>
-    </w:p>
-    <w:p>
-      <w:pPr>
-        <w:spacing w:after="80" w:before="240"/>
-      </w:pPr>
-      <w:r>
-        <w:rPr>
-          <w:rFonts w:ascii="Arial" w:cs="Arial" w:eastAsia="Arial" w:hAnsi="Arial"/>
-          <w:b/>
-          <w:bCs/>
-          <w:color w:val="111827"/>
-          <w:sz w:val="24"/>
-          <w:szCs w:val="24"/>
-        </w:rPr>
-        <w:t xml:space="preserve">Explicitly skipped — with a reason</w:t>
-      </w:r>
-    </w:p>
-    <w:p>
-      <w:pPr>
         <w:pStyle w:val="ListParagraph"/>
         <w:numPr>
           <w:ilvl w:val="0"/>
@@ -2120,7 +2665,7 @@
           <w:sz w:val="22"/>
           <w:szCs w:val="22"/>
         </w:rPr>
-        <w:t xml:space="preserve">Email notifications → Supabase edge function pattern documented, not built</w:t>
+        <w:t xml:space="preserve">Auth middleware — unauthenticated direct URL access redirects to login</w:t>
       </w:r>
     </w:p>
     <w:p>
@@ -2141,7 +2686,7 @@
           <w:sz w:val="22"/>
           <w:szCs w:val="22"/>
         </w:rPr>
-        <w:t xml:space="preserve">Mobile optimisation → works on mobile, not optimised</w:t>
+        <w:t xml:space="preserve">Fully responsive — sidebar drawer, mobile-first, no overflow at 375px</w:t>
       </w:r>
     </w:p>
     <w:p>
@@ -2162,7 +2707,28 @@
           <w:sz w:val="22"/>
           <w:szCs w:val="22"/>
         </w:rPr>
-        <w:t xml:space="preserve">Full org chart → three roles covers the real use case</w:t>
+        <w:t xml:space="preserve">Lighthouse: 100 Accessibility · 100 Best Practices · 100 SEO · 81 Performance</w:t>
+      </w:r>
+    </w:p>
+    <w:p>
+      <w:pPr>
+        <w:spacing w:after="160" w:before="0"/>
+      </w:pPr>
+    </w:p>
+    <w:p>
+      <w:pPr>
+        <w:spacing w:after="80" w:before="240"/>
+      </w:pPr>
+      <w:r>
+        <w:rPr>
+          <w:rFonts w:ascii="Arial" w:cs="Arial" w:eastAsia="Arial" w:hAnsi="Arial"/>
+          <w:b/>
+          <w:bCs/>
+          <w:color w:val="111827"/>
+          <w:sz w:val="24"/>
+          <w:szCs w:val="24"/>
+        </w:rPr>
+        <w:t xml:space="preserve">Explicitly skipped — with a reason</w:t>
       </w:r>
     </w:p>
     <w:p>
@@ -2183,7 +2749,70 @@
           <w:sz w:val="22"/>
           <w:szCs w:val="22"/>
         </w:rPr>
+        <w:t xml:space="preserve">Email notifications → Supabase edge function pattern documented, not built</w:t>
+      </w:r>
+    </w:p>
+    <w:p>
+      <w:pPr>
+        <w:pStyle w:val="ListParagraph"/>
+        <w:numPr>
+          <w:ilvl w:val="0"/>
+          <w:numId w:val="2"/>
+        </w:numPr>
+        <w:spacing w:after="80" w:before="0"/>
+      </w:pPr>
+      <w:r>
+        <w:rPr>
+          <w:rFonts w:ascii="Arial" w:cs="Arial" w:eastAsia="Arial" w:hAnsi="Arial"/>
+          <w:b w:val="false"/>
+          <w:bCs w:val="false"/>
+          <w:color w:val="111827"/>
+          <w:sz w:val="22"/>
+          <w:szCs w:val="22"/>
+        </w:rPr>
+        <w:t xml:space="preserve">Full org chart → three roles covers the real use case</w:t>
+      </w:r>
+    </w:p>
+    <w:p>
+      <w:pPr>
+        <w:pStyle w:val="ListParagraph"/>
+        <w:numPr>
+          <w:ilvl w:val="0"/>
+          <w:numId w:val="2"/>
+        </w:numPr>
+        <w:spacing w:after="80" w:before="0"/>
+      </w:pPr>
+      <w:r>
+        <w:rPr>
+          <w:rFonts w:ascii="Arial" w:cs="Arial" w:eastAsia="Arial" w:hAnsi="Arial"/>
+          <w:b w:val="false"/>
+          <w:bCs w:val="false"/>
+          <w:color w:val="111827"/>
+          <w:sz w:val="22"/>
+          <w:szCs w:val="22"/>
+        </w:rPr>
         <w:t xml:space="preserve">Per-flow DB tables → JSONB + Zod is the right call for a prototype</w:t>
+      </w:r>
+    </w:p>
+    <w:p>
+      <w:pPr>
+        <w:pStyle w:val="ListParagraph"/>
+        <w:numPr>
+          <w:ilvl w:val="0"/>
+          <w:numId w:val="2"/>
+        </w:numPr>
+        <w:spacing w:after="80" w:before="0"/>
+      </w:pPr>
+      <w:r>
+        <w:rPr>
+          <w:rFonts w:ascii="Arial" w:cs="Arial" w:eastAsia="Arial" w:hAnsi="Arial"/>
+          <w:b w:val="false"/>
+          <w:bCs w:val="false"/>
+          <w:color w:val="111827"/>
+          <w:sz w:val="22"/>
+          <w:szCs w:val="22"/>
+        </w:rPr>
+        <w:t xml:space="preserve">LCP below 2.5s → Suspense streaming identified, deferred; current 4.2s is DB latency</w:t>
       </w:r>
     </w:p>
     <w:p>
@@ -2204,7 +2833,7 @@
           <w:sz w:val="22"/>
           <w:szCs w:val="22"/>
         </w:rPr>
-        <w:t xml:space="preserve">"Most prototypes fake the security layer and call it MVP. This one has RLS, a service client pattern, and an audit log — because at Mal, a prototype sometimes ships."</w:t>
+        <w:t xml:space="preserve">"Most prototypes fake the security layer and call it MVP. This one has RLS, a service client pattern, an audit log, auth middleware, and a 100 accessibility score — because at Mal, a prototype sometimes ships."</w:t>
       </w:r>
     </w:p>
     <w:p>
@@ -2364,6 +2993,22 @@
           <w:sz w:val="22"/>
           <w:szCs w:val="22"/>
         </w:rPr>
+        <w:t xml:space="preserve">Responsive. Auth middleware. 100 Accessibility. 100 SEO.</w:t>
+      </w:r>
+    </w:p>
+    <w:p>
+      <w:pPr>
+        <w:spacing w:after="120" w:before="0"/>
+      </w:pPr>
+      <w:r>
+        <w:rPr>
+          <w:rFonts w:ascii="Arial" w:cs="Arial" w:eastAsia="Arial" w:hAnsi="Arial"/>
+          <w:b w:val="false"/>
+          <w:bCs w:val="false"/>
+          <w:color w:val="111827"/>
+          <w:sz w:val="22"/>
+          <w:szCs w:val="22"/>
+        </w:rPr>
         <w:t xml:space="preserve">Full docs. Architecture decisions written before code.</w:t>
       </w:r>
     </w:p>
@@ -2385,7 +3030,7 @@
           <w:sz w:val="22"/>
           <w:szCs w:val="22"/>
         </w:rPr>
-        <w:t xml:space="preserve">The remaining time is for performance, SEO, and whatever the team wants to test next.</w:t>
+        <w:t xml:space="preserve">The remaining time is for Suspense streaming, bundle analysis, and whatever the team wants to test next.</w:t>
       </w:r>
     </w:p>
     <w:p>
@@ -2552,7 +3197,28 @@
           <w:sz w:val="22"/>
           <w:szCs w:val="22"/>
         </w:rPr>
-        <w:t xml:space="preserve">Performance + SEO polish</w:t>
+        <w:t xml:space="preserve">LCP below 2.5s — Suspense streaming so shell paints while DB query runs</w:t>
+      </w:r>
+    </w:p>
+    <w:p>
+      <w:pPr>
+        <w:pStyle w:val="ListParagraph"/>
+        <w:numPr>
+          <w:ilvl w:val="0"/>
+          <w:numId w:val="2"/>
+        </w:numPr>
+        <w:spacing w:after="80" w:before="0"/>
+      </w:pPr>
+      <w:r>
+        <w:rPr>
+          <w:rFonts w:ascii="Arial" w:cs="Arial" w:eastAsia="Arial" w:hAnsi="Arial"/>
+          <w:b w:val="false"/>
+          <w:bCs w:val="false"/>
+          <w:color w:val="111827"/>
+          <w:sz w:val="22"/>
+          <w:szCs w:val="22"/>
+        </w:rPr>
+        <w:t xml:space="preserve">Remove 56 KiB unused JS — bundle analyser audit on shadcn/radix-ui imports</w:t>
       </w:r>
     </w:p>
     <w:p>
@@ -2973,7 +3639,7 @@
         <w:spacing w:after="80" w:before="0"/>
         <w:jc w:val="center"/>
       </w:pPr>
-      <w:hyperlink w:history="1" r:id="rIdn4ueco9tzwjlv2r7exxzx">
+      <w:hyperlink w:history="1" r:id="rIdhybq-ycs3lgmfijqhdrxm">
         <w:r>
           <w:rPr>
             <w:rFonts w:ascii="Arial" w:cs="Arial" w:eastAsia="Arial" w:hAnsi="Arial"/>

</xml_diff>